<commit_message>
docs: correct team member name in FarmBook requirements
</commit_message>
<xml_diff>
--- a/docs/requirements/FARMBOOK_Project_Requirements-V1.docx
+++ b/docs/requirements/FARMBOOK_Project_Requirements-V1.docx
@@ -81,10 +81,12 @@
           <w:szCs w:val="72"/>
           <w:lang w:val="en-US"/>
         </w:rPr>
-        <w:t xml:space="preserve">CAB302 – </w:t>
-      </w:r>
-      <w:proofErr w:type="spellStart"/>
-      <w:r>
+        <w:t>CAB302 – FarmBook</w:t>
+      </w:r>
+    </w:p>
+    <w:p>
+      <w:pPr>
+        <w:jc w:val="center"/>
         <w:rPr>
           <w:rFonts w:cstheme="minorHAnsi"/>
           <w:b/>
@@ -94,13 +96,8 @@
           <w:szCs w:val="72"/>
           <w:lang w:val="en-US"/>
         </w:rPr>
-        <w:t>FarmBook</w:t>
-      </w:r>
-      <w:proofErr w:type="spellEnd"/>
-    </w:p>
-    <w:p>
-      <w:pPr>
-        <w:jc w:val="center"/>
+      </w:pPr>
+      <w:r>
         <w:rPr>
           <w:rFonts w:cstheme="minorHAnsi"/>
           <w:b/>
@@ -110,25 +107,23 @@
           <w:szCs w:val="72"/>
           <w:lang w:val="en-US"/>
         </w:rPr>
-      </w:pPr>
-      <w:proofErr w:type="spellStart"/>
-      <w:r>
+        <w:t>Idontknow</w:t>
+      </w:r>
+    </w:p>
+    <w:p>
+      <w:pPr>
+        <w:jc w:val="center"/>
         <w:rPr>
           <w:rFonts w:cstheme="minorHAnsi"/>
           <w:b/>
           <w:bCs/>
           <w:color w:val="000000" w:themeColor="text1"/>
-          <w:sz w:val="72"/>
-          <w:szCs w:val="72"/>
+          <w:sz w:val="32"/>
+          <w:szCs w:val="32"/>
           <w:lang w:val="en-US"/>
         </w:rPr>
-        <w:t>Idontknow</w:t>
-      </w:r>
-      <w:proofErr w:type="spellEnd"/>
-    </w:p>
-    <w:p>
-      <w:pPr>
-        <w:jc w:val="center"/>
+      </w:pPr>
+      <w:r>
         <w:rPr>
           <w:rFonts w:cstheme="minorHAnsi"/>
           <w:b/>
@@ -138,7 +133,8 @@
           <w:szCs w:val="32"/>
           <w:lang w:val="en-US"/>
         </w:rPr>
-      </w:pPr>
+        <w:t xml:space="preserve">1. </w:t>
+      </w:r>
       <w:r>
         <w:rPr>
           <w:rFonts w:cstheme="minorHAnsi"/>
@@ -149,7 +145,7 @@
           <w:szCs w:val="32"/>
           <w:lang w:val="en-US"/>
         </w:rPr>
-        <w:t>1. Samuel Hunt</w:t>
+        <w:t>Ronell Adri</w:t>
       </w:r>
     </w:p>
     <w:p>
@@ -188,7 +184,7 @@
           <w:color w:val="000000" w:themeColor="text1"/>
           <w:sz w:val="32"/>
           <w:szCs w:val="32"/>
-          <w:lang w:val="en-US"/>
+          <w:lang w:val="nb-NO"/>
         </w:rPr>
       </w:pPr>
       <w:r>
@@ -199,7 +195,7 @@
           <w:color w:val="000000" w:themeColor="text1"/>
           <w:sz w:val="32"/>
           <w:szCs w:val="32"/>
-          <w:lang w:val="en-US"/>
+          <w:lang w:val="nb-NO"/>
         </w:rPr>
         <w:t>3. Rohan Karki</w:t>
       </w:r>
@@ -214,7 +210,7 @@
           <w:color w:val="000000" w:themeColor="text1"/>
           <w:sz w:val="32"/>
           <w:szCs w:val="32"/>
-          <w:lang w:val="en-US"/>
+          <w:lang w:val="nb-NO"/>
         </w:rPr>
       </w:pPr>
       <w:r>
@@ -225,7 +221,7 @@
           <w:color w:val="000000" w:themeColor="text1"/>
           <w:sz w:val="32"/>
           <w:szCs w:val="32"/>
-          <w:lang w:val="en-US"/>
+          <w:lang w:val="nb-NO"/>
         </w:rPr>
         <w:t>4. Vy Nguyen</w:t>
       </w:r>
@@ -240,7 +236,7 @@
           <w:color w:val="000000" w:themeColor="text1"/>
           <w:sz w:val="32"/>
           <w:szCs w:val="32"/>
-          <w:lang w:val="en-US"/>
+          <w:lang w:val="nb-NO"/>
         </w:rPr>
       </w:pPr>
       <w:r>
@@ -251,7 +247,7 @@
           <w:color w:val="000000" w:themeColor="text1"/>
           <w:sz w:val="32"/>
           <w:szCs w:val="32"/>
-          <w:lang w:val="en-US"/>
+          <w:lang w:val="nb-NO"/>
         </w:rPr>
         <w:t>5. Kevin Pham</w:t>
       </w:r>
@@ -265,6 +261,7 @@
           <w:color w:val="000000" w:themeColor="text1"/>
           <w:sz w:val="32"/>
           <w:szCs w:val="32"/>
+          <w:lang w:val="nb-NO"/>
         </w:rPr>
       </w:pPr>
       <w:r>
@@ -273,6 +270,7 @@
           <w:b/>
           <w:bCs/>
           <w:color w:val="000000" w:themeColor="text1"/>
+          <w:lang w:val="nb-NO"/>
         </w:rPr>
         <w:br w:type="page"/>
       </w:r>
@@ -317,8 +315,24 @@
           <w:bCs/>
           <w:color w:val="000000" w:themeColor="text1"/>
         </w:rPr>
-        <w:t>P</w:t>
-      </w:r>
+        <w:t>Project name</w:t>
+      </w:r>
+      <w:r>
+        <w:rPr>
+          <w:rFonts w:cstheme="minorHAnsi"/>
+          <w:color w:val="000000" w:themeColor="text1"/>
+        </w:rPr>
+        <w:t>: FarmBook</w:t>
+      </w:r>
+    </w:p>
+    <w:p>
+      <w:pPr>
+        <w:spacing w:line="360" w:lineRule="auto"/>
+        <w:rPr>
+          <w:rFonts w:cstheme="minorHAnsi"/>
+          <w:color w:val="000000" w:themeColor="text1"/>
+        </w:rPr>
+      </w:pPr>
       <w:r>
         <w:rPr>
           <w:rFonts w:cstheme="minorHAnsi"/>
@@ -326,24 +340,15 @@
           <w:bCs/>
           <w:color w:val="000000" w:themeColor="text1"/>
         </w:rPr>
-        <w:t>roject name</w:t>
+        <w:t>Project type</w:t>
       </w:r>
       <w:r>
         <w:rPr>
           <w:rFonts w:cstheme="minorHAnsi"/>
           <w:color w:val="000000" w:themeColor="text1"/>
         </w:rPr>
-        <w:t xml:space="preserve">: </w:t>
-      </w:r>
-      <w:proofErr w:type="spellStart"/>
-      <w:r>
-        <w:rPr>
-          <w:rFonts w:cstheme="minorHAnsi"/>
-          <w:color w:val="000000" w:themeColor="text1"/>
-        </w:rPr>
-        <w:t>FarmBook</w:t>
-      </w:r>
-      <w:proofErr w:type="spellEnd"/>
+        <w:t>: Farm inventory and farm-operations management desktop application.</w:t>
+      </w:r>
     </w:p>
     <w:p>
       <w:pPr>
@@ -360,14 +365,14 @@
           <w:bCs/>
           <w:color w:val="000000" w:themeColor="text1"/>
         </w:rPr>
-        <w:t>Project type</w:t>
+        <w:t>Target users</w:t>
       </w:r>
       <w:r>
         <w:rPr>
           <w:rFonts w:cstheme="minorHAnsi"/>
           <w:color w:val="000000" w:themeColor="text1"/>
         </w:rPr>
-        <w:t>: Farm inventory and farm-operations management desktop application.</w:t>
+        <w:t>: Farmers / farm operators who need one place to monitor crops, stock, livestock and selected farm resources.</w:t>
       </w:r>
     </w:p>
     <w:p>
@@ -385,21 +390,14 @@
           <w:bCs/>
           <w:color w:val="000000" w:themeColor="text1"/>
         </w:rPr>
-        <w:t>Target users</w:t>
+        <w:t>Problem statement</w:t>
       </w:r>
       <w:r>
         <w:rPr>
           <w:rFonts w:cstheme="minorHAnsi"/>
           <w:color w:val="000000" w:themeColor="text1"/>
         </w:rPr>
-        <w:t xml:space="preserve">: </w:t>
-      </w:r>
-      <w:r>
-        <w:rPr>
-          <w:rFonts w:cstheme="minorHAnsi"/>
-          <w:color w:val="000000" w:themeColor="text1"/>
-        </w:rPr>
-        <w:t>Farmers / farm operators who need one place to monitor crops, stock, livestock and selected farm resources.</w:t>
+        <w:t>: FarmBook addresses the difficulty of keeping farm information organised across crops, inventory, livestock, resource use and maintenance. The project aims to place these records in one system so a farmer can check the current state of the farm more easily and make more informed operational decisions.</w:t>
       </w:r>
     </w:p>
     <w:p>
@@ -417,30 +415,14 @@
           <w:bCs/>
           <w:color w:val="000000" w:themeColor="text1"/>
         </w:rPr>
-        <w:t>Problem statement</w:t>
+        <w:t>Proposed solution</w:t>
       </w:r>
       <w:r>
         <w:rPr>
           <w:rFonts w:cstheme="minorHAnsi"/>
           <w:color w:val="000000" w:themeColor="text1"/>
         </w:rPr>
-        <w:t xml:space="preserve">: </w:t>
-      </w:r>
-      <w:proofErr w:type="spellStart"/>
-      <w:r>
-        <w:rPr>
-          <w:rFonts w:cstheme="minorHAnsi"/>
-          <w:color w:val="000000" w:themeColor="text1"/>
-        </w:rPr>
-        <w:t>FarmBook</w:t>
-      </w:r>
-      <w:proofErr w:type="spellEnd"/>
-      <w:r>
-        <w:rPr>
-          <w:rFonts w:cstheme="minorHAnsi"/>
-          <w:color w:val="000000" w:themeColor="text1"/>
-        </w:rPr>
-        <w:t xml:space="preserve"> addresses the difficulty of keeping farm information organised across crops, inventory, livestock, resource use and maintenance. The project aims to place these records in one system so a farmer can check the current state of the farm more easily and make more informed operational decisions.</w:t>
+        <w:t>: FarmBook will provide a front end that farmers can use to view and update farm information, supported by a back end that stores and manages operational records such as stock movements, livestock data, crop progress, water/energy use and waste records.</w:t>
       </w:r>
     </w:p>
     <w:p>
@@ -458,40 +440,15 @@
           <w:bCs/>
           <w:color w:val="000000" w:themeColor="text1"/>
         </w:rPr>
-        <w:t>Proposed solution</w:t>
+        <w:t>Technology for Sustainable Futures</w:t>
       </w:r>
       <w:r>
         <w:rPr>
           <w:rFonts w:cstheme="minorHAnsi"/>
           <w:color w:val="000000" w:themeColor="text1"/>
         </w:rPr>
-        <w:t xml:space="preserve">: </w:t>
-      </w:r>
-      <w:proofErr w:type="spellStart"/>
-      <w:r>
-        <w:rPr>
-          <w:rFonts w:cstheme="minorHAnsi"/>
-          <w:color w:val="000000" w:themeColor="text1"/>
-        </w:rPr>
-        <w:t>FarmBook</w:t>
-      </w:r>
-      <w:proofErr w:type="spellEnd"/>
-      <w:r>
-        <w:rPr>
-          <w:rFonts w:cstheme="minorHAnsi"/>
-          <w:color w:val="000000" w:themeColor="text1"/>
-        </w:rPr>
-        <w:t xml:space="preserve"> will provide a front end that farmers can use to view and update farm information, supported by a back end that stores and manages operational records such as stock movements, livestock data, crop progress, water/energy use and waste records.</w:t>
-      </w:r>
-    </w:p>
-    <w:p>
-      <w:pPr>
-        <w:spacing w:line="360" w:lineRule="auto"/>
-        <w:rPr>
-          <w:rFonts w:cstheme="minorHAnsi"/>
-          <w:color w:val="000000" w:themeColor="text1"/>
-        </w:rPr>
-      </w:pPr>
+        <w:t>:</w:t>
+      </w:r>
       <w:r>
         <w:rPr>
           <w:rFonts w:cstheme="minorHAnsi"/>
@@ -499,46 +456,14 @@
           <w:bCs/>
           <w:color w:val="000000" w:themeColor="text1"/>
         </w:rPr>
-        <w:t>Technology for Sustainable Futures</w:t>
+        <w:t xml:space="preserve"> </w:t>
       </w:r>
       <w:r>
         <w:rPr>
           <w:rFonts w:cstheme="minorHAnsi"/>
           <w:color w:val="000000" w:themeColor="text1"/>
         </w:rPr>
-        <w:t>:</w:t>
-      </w:r>
-      <w:r>
-        <w:rPr>
-          <w:rFonts w:cstheme="minorHAnsi"/>
-          <w:b/>
-          <w:bCs/>
-          <w:color w:val="000000" w:themeColor="text1"/>
-        </w:rPr>
-        <w:t xml:space="preserve"> </w:t>
-      </w:r>
-      <w:r>
-        <w:rPr>
-          <w:rFonts w:cstheme="minorHAnsi"/>
-          <w:color w:val="000000" w:themeColor="text1"/>
-        </w:rPr>
-        <w:t xml:space="preserve">The strongest sustainability connection in the current idea is resource efficiency. By helping farmers track inventory, waste, water and energy use, </w:t>
-      </w:r>
-      <w:proofErr w:type="spellStart"/>
-      <w:r>
-        <w:rPr>
-          <w:rFonts w:cstheme="minorHAnsi"/>
-          <w:color w:val="000000" w:themeColor="text1"/>
-        </w:rPr>
-        <w:t>FarmBook</w:t>
-      </w:r>
-      <w:proofErr w:type="spellEnd"/>
-      <w:r>
-        <w:rPr>
-          <w:rFonts w:cstheme="minorHAnsi"/>
-          <w:color w:val="000000" w:themeColor="text1"/>
-        </w:rPr>
-        <w:t xml:space="preserve"> can support better visibility of resource consumption and more informed farm-management decisions. The project can also support economic sustainability by improving stock control and reducing unnecessary resource use.</w:t>
+        <w:t>The strongest sustainability connection in the current idea is resource efficiency. By helping farmers track inventory, waste, water and energy use, FarmBook can support better visibility of resource consumption and more informed farm-management decisions. The project can also support economic sustainability by improving stock control and reducing unnecessary resource use.</w:t>
       </w:r>
     </w:p>
     <w:p>
@@ -1435,21 +1360,7 @@
               <w:rPr>
                 <w:color w:val="000000" w:themeColor="text1"/>
               </w:rPr>
-              <w:t xml:space="preserve">The system shall allow registered users to securely access </w:t>
-            </w:r>
-            <w:proofErr w:type="spellStart"/>
-            <w:r>
-              <w:rPr>
-                <w:color w:val="000000" w:themeColor="text1"/>
-              </w:rPr>
-              <w:t>FarmBook</w:t>
-            </w:r>
-            <w:proofErr w:type="spellEnd"/>
-            <w:r>
-              <w:rPr>
-                <w:color w:val="000000" w:themeColor="text1"/>
-              </w:rPr>
-              <w:t>.</w:t>
+              <w:t>The system shall allow registered users to securely access FarmBook.</w:t>
             </w:r>
           </w:p>
         </w:tc>
@@ -2199,21 +2110,7 @@
               <w:rPr>
                 <w:color w:val="000000" w:themeColor="text1"/>
               </w:rPr>
-              <w:t xml:space="preserve">The system shall store relevant </w:t>
-            </w:r>
-            <w:proofErr w:type="spellStart"/>
-            <w:r>
-              <w:rPr>
-                <w:color w:val="000000" w:themeColor="text1"/>
-              </w:rPr>
-              <w:t>FarmBook</w:t>
-            </w:r>
-            <w:proofErr w:type="spellEnd"/>
-            <w:r>
-              <w:rPr>
-                <w:color w:val="000000" w:themeColor="text1"/>
-              </w:rPr>
-              <w:t xml:space="preserve"> information so that it remains available across application sessions.</w:t>
+              <w:t>The system shall store relevant FarmBook information so that it remains available across application sessions.</w:t>
             </w:r>
           </w:p>
         </w:tc>
@@ -3875,6 +3772,7 @@
   <w:style w:type="character" w:default="1" w:styleId="DefaultParagraphFont">
     <w:name w:val="Default Paragraph Font"/>
     <w:uiPriority w:val="1"/>
+    <w:semiHidden/>
     <w:unhideWhenUsed/>
   </w:style>
   <w:style w:type="table" w:default="1" w:styleId="TableNormal">

</xml_diff>